<commit_message>
Docs label and signatories
1. Label can be changed. Once label has a value, name and position will now be required.

2. admin cant type the name and position if there is no label.
</commit_message>
<xml_diff>
--- a/resources/document-templates/doc13-venture-exit-template.docx
+++ b/resources/document-templates/doc13-venture-exit-template.docx
@@ -2098,6 +2098,23 @@
         <w:jc w:val="both"/>
         <w:rPr>
           <w:rFonts w:ascii="Times New Roman" w:eastAsia="Times New Roman" w:hAnsi="Times New Roman" w:cs="Times New Roman"/>
+        </w:rPr>
+      </w:pPr>
+    </w:p>
+    <w:p>
+      <w:pPr>
+        <w:spacing w:after="0"/>
+      </w:pPr>
+      <w:r>
+        <w:t>${sig_slot_1}</w:t>
+      </w:r>
+    </w:p>
+    <w:p>
+      <w:pPr>
+        <w:spacing w:after="0"/>
+        <w:jc w:val="both"/>
+        <w:rPr>
+          <w:rFonts w:ascii="Times New Roman" w:eastAsia="Times New Roman" w:hAnsi="Times New Roman" w:cs="Times New Roman"/>
           <w:b/>
           <w:bCs/>
           <w:sz w:val="24"/>
@@ -2112,7 +2129,7 @@
           <w:sz w:val="24"/>
           <w:szCs w:val="24"/>
         </w:rPr>
-        <w:t>Evaluated by:</w:t>
+        <w:t xml:space="preserve">${evaluated_by_label}</w:t>
       </w:r>
     </w:p>
     <w:p>
@@ -2244,6 +2261,35 @@
           <w:szCs w:val="24"/>
         </w:rPr>
       </w:pPr>
+    </w:p>
+    <w:p>
+      <w:pPr>
+        <w:spacing w:after="0"/>
+      </w:pPr>
+      <w:r>
+        <w:t>${/sig_slot_1}</w:t>
+      </w:r>
+    </w:p>
+    <w:p>
+      <w:pPr>
+        <w:spacing w:after="0"/>
+      </w:pPr>
+      <w:r>
+        <w:t>${sig_slot_2}</w:t>
+      </w:r>
+    </w:p>
+    <w:p>
+      <w:pPr>
+        <w:spacing w:after="0"/>
+        <w:jc w:val="both"/>
+        <w:rPr>
+          <w:rFonts w:ascii="Times New Roman" w:eastAsia="Times New Roman" w:hAnsi="Times New Roman" w:cs="Times New Roman"/>
+          <w:b/>
+          <w:bCs/>
+          <w:sz w:val="24"/>
+          <w:szCs w:val="24"/>
+        </w:rPr>
+      </w:pPr>
       <w:r>
         <w:rPr>
           <w:rFonts w:ascii="Times New Roman" w:eastAsia="Times New Roman" w:hAnsi="Times New Roman" w:cs="Times New Roman"/>
@@ -2252,7 +2298,7 @@
           <w:sz w:val="24"/>
           <w:szCs w:val="24"/>
         </w:rPr>
-        <w:t>Reviewed by:</w:t>
+        <w:t xml:space="preserve">${reviewed_by_label}</w:t>
       </w:r>
     </w:p>
     <w:p>
@@ -2341,6 +2387,14 @@
     <w:p>
       <w:pPr>
         <w:spacing w:after="0"/>
+      </w:pPr>
+      <w:r>
+        <w:t>${/sig_slot_2}</w:t>
+      </w:r>
+    </w:p>
+    <w:p>
+      <w:pPr>
+        <w:spacing w:after="0"/>
         <w:ind w:left="5040" w:firstLine="720"/>
         <w:jc w:val="both"/>
         <w:rPr>
@@ -2359,7 +2413,7 @@
           <w:sz w:val="24"/>
           <w:szCs w:val="24"/>
         </w:rPr>
-        <w:t>Noted by:</w:t>
+        <w:t xml:space="preserve">${noted_by_label}</w:t>
       </w:r>
     </w:p>
     <w:p>

</xml_diff>